<commit_message>
Doc Request 2044 and 2045
</commit_message>
<xml_diff>
--- a/Supporting Files/Synfynal Content fixes for Bing.docx
+++ b/Supporting Files/Synfynal Content fixes for Bing.docx
@@ -75,112 +75,6 @@
                 <w:bCs/>
               </w:rPr>
               <w:t>New Value</w:t>
-            </w:r>
-          </w:p>
-        </w:tc>
-      </w:tr>
-      <w:tr>
-        <w:tc>
-          <w:tcPr>
-            <w:tcW w:w="4045" w:type="dxa"/>
-          </w:tcPr>
-          <w:p>
-            <w:pPr>
-              <w:rPr>
-                <w:lang w:val="en-CA"/>
-              </w:rPr>
-            </w:pPr>
-            <w:r>
-              <w:rPr>
-                <w:lang w:val="en-CA"/>
-              </w:rPr>
-              <w:t>&lt;</w:t>
-            </w:r>
-            <w:proofErr w:type="spellStart"/>
-            <w:r>
-              <w:rPr>
-                <w:lang w:val="en-CA"/>
-              </w:rPr>
-              <w:t>img</w:t>
-            </w:r>
-            <w:proofErr w:type="spellEnd"/>
-            <w:r>
-              <w:rPr>
-                <w:lang w:val="en-CA"/>
-              </w:rPr>
-              <w:t xml:space="preserve"> </w:t>
-            </w:r>
-            <w:proofErr w:type="spellStart"/>
-            <w:r>
-              <w:rPr>
-                <w:lang w:val="en-CA"/>
-              </w:rPr>
-              <w:t>src</w:t>
-            </w:r>
-            <w:proofErr w:type="spellEnd"/>
-            <w:r>
-              <w:rPr>
-                <w:lang w:val="en-CA"/>
-              </w:rPr>
-              <w:t>="../articles/media/logo.png" alt="" class="logomark"&gt;</w:t>
-            </w:r>
-          </w:p>
-        </w:tc>
-        <w:tc>
-          <w:tcPr>
-            <w:tcW w:w="4450" w:type="dxa"/>
-          </w:tcPr>
-          <w:p>
-            <w:pPr>
-              <w:rPr>
-                <w:lang w:val="en-CA"/>
-              </w:rPr>
-            </w:pPr>
-            <w:r>
-              <w:rPr>
-                <w:lang w:val="en-CA"/>
-              </w:rPr>
-              <w:t>&lt;</w:t>
-            </w:r>
-            <w:proofErr w:type="spellStart"/>
-            <w:r>
-              <w:rPr>
-                <w:lang w:val="en-CA"/>
-              </w:rPr>
-              <w:t>img</w:t>
-            </w:r>
-            <w:proofErr w:type="spellEnd"/>
-            <w:r>
-              <w:rPr>
-                <w:lang w:val="en-CA"/>
-              </w:rPr>
-              <w:t xml:space="preserve"> </w:t>
-            </w:r>
-            <w:proofErr w:type="spellStart"/>
-            <w:r>
-              <w:rPr>
-                <w:lang w:val="en-CA"/>
-              </w:rPr>
-              <w:t>src</w:t>
-            </w:r>
-            <w:proofErr w:type="spellEnd"/>
-            <w:r>
-              <w:rPr>
-                <w:lang w:val="en-CA"/>
-              </w:rPr>
-              <w:t>="../articles/media/logo.png" alt="</w:t>
-            </w:r>
-            <w:r>
-              <w:rPr>
-                <w:lang w:val="en-CA"/>
-              </w:rPr>
-              <w:t>Synfynal logo</w:t>
-            </w:r>
-            <w:r>
-              <w:rPr>
-                <w:lang w:val="en-CA"/>
-              </w:rPr>
-              <w:t>" class="logomark"&gt;</w:t>
             </w:r>
           </w:p>
         </w:tc>
@@ -782,6 +676,7 @@
   <w:style w:type="character" w:default="1" w:styleId="DefaultParagraphFont">
     <w:name w:val="Default Paragraph Font"/>
     <w:uiPriority w:val="1"/>
+    <w:semiHidden/>
     <w:unhideWhenUsed/>
   </w:style>
   <w:style w:type="table" w:default="1" w:styleId="TableNormal">

</xml_diff>